<commit_message>
Added How to install sqlpostgrees
</commit_message>
<xml_diff>
--- a/documents/step by step learn fast api.docx
+++ b/documents/step by step learn fast api.docx
@@ -68,8 +68,13 @@
           <w:numId w:val="1"/>
         </w:numPr>
       </w:pPr>
-      <w:r>
-        <w:t xml:space="preserve">Command :- python -m </w:t>
+      <w:proofErr w:type="gramStart"/>
+      <w:r>
+        <w:t>Command :</w:t>
+      </w:r>
+      <w:proofErr w:type="gramEnd"/>
+      <w:r>
+        <w:t xml:space="preserve">- python -m </w:t>
       </w:r>
       <w:proofErr w:type="spellStart"/>
       <w:r>
@@ -91,8 +96,17 @@
           <w:numId w:val="1"/>
         </w:numPr>
       </w:pPr>
-      <w:r>
-        <w:t>Activate :- .\</w:t>
+      <w:proofErr w:type="gramStart"/>
+      <w:r>
+        <w:t>Activate :</w:t>
+      </w:r>
+      <w:proofErr w:type="gramEnd"/>
+      <w:r>
+        <w:t>-</w:t>
+      </w:r>
+      <w:proofErr w:type="gramStart"/>
+      <w:r>
+        <w:t xml:space="preserve"> .\</w:t>
       </w:r>
       <w:proofErr w:type="spellStart"/>
       <w:r>
@@ -103,12 +117,24 @@
         <w:t>\Script\</w:t>
       </w:r>
       <w:r>
-        <w:t xml:space="preserve">Activate </w:t>
-      </w:r>
-    </w:p>
-    <w:p>
-      <w:r>
-        <w:t xml:space="preserve">Step 02 : install related package </w:t>
+        <w:t>Activate</w:t>
+      </w:r>
+      <w:proofErr w:type="gramEnd"/>
+      <w:r>
+        <w:t xml:space="preserve"> </w:t>
+      </w:r>
+    </w:p>
+    <w:p>
+      <w:r>
+        <w:t xml:space="preserve">Step </w:t>
+      </w:r>
+      <w:proofErr w:type="gramStart"/>
+      <w:r>
+        <w:t>02 :</w:t>
+      </w:r>
+      <w:proofErr w:type="gramEnd"/>
+      <w:r>
+        <w:t xml:space="preserve"> install related package </w:t>
       </w:r>
     </w:p>
     <w:p>
@@ -123,6 +149,7 @@
         <w:t xml:space="preserve">Pip -m install </w:t>
       </w:r>
       <w:proofErr w:type="spellStart"/>
+      <w:proofErr w:type="gramStart"/>
       <w:r>
         <w:t>FastAPI</w:t>
       </w:r>
@@ -131,15 +158,32 @@
         <w:t xml:space="preserve"> </w:t>
       </w:r>
       <w:r>
-        <w:t xml:space="preserve"> or pip -m install “</w:t>
-      </w:r>
-      <w:proofErr w:type="spellStart"/>
+        <w:t xml:space="preserve"> or</w:t>
+      </w:r>
+      <w:proofErr w:type="gramEnd"/>
+      <w:r>
+        <w:t xml:space="preserve"> pip -m install “</w:t>
+      </w:r>
+      <w:proofErr w:type="spellStart"/>
+      <w:proofErr w:type="gramStart"/>
       <w:r>
         <w:t>FastAPI</w:t>
       </w:r>
       <w:proofErr w:type="spellEnd"/>
       <w:r>
-        <w:t>[“standard ”]”</w:t>
+        <w:t>[</w:t>
+      </w:r>
+      <w:proofErr w:type="gramEnd"/>
+      <w:r>
+        <w:t>“</w:t>
+      </w:r>
+      <w:proofErr w:type="gramStart"/>
+      <w:r>
+        <w:t>standard ”</w:t>
+      </w:r>
+      <w:proofErr w:type="gramEnd"/>
+      <w:r>
+        <w:t>]”</w:t>
       </w:r>
     </w:p>
     <w:p>
@@ -269,8 +313,13 @@
           <w:bCs/>
         </w:rPr>
       </w:pPr>
-      <w:r>
-        <w:t xml:space="preserve">Ready  for running fast </w:t>
+      <w:proofErr w:type="gramStart"/>
+      <w:r>
+        <w:t>Ready  for</w:t>
+      </w:r>
+      <w:proofErr w:type="gramEnd"/>
+      <w:r>
+        <w:t xml:space="preserve"> running fast </w:t>
       </w:r>
       <w:proofErr w:type="spellStart"/>
       <w:r>
@@ -359,12 +408,17 @@
         <w:t xml:space="preserve">App = </w:t>
       </w:r>
       <w:proofErr w:type="spellStart"/>
+      <w:proofErr w:type="gramStart"/>
       <w:r>
         <w:t>FastAPI</w:t>
       </w:r>
       <w:proofErr w:type="spellEnd"/>
       <w:r>
-        <w:t xml:space="preserve">()   </w:t>
+        <w:t>(</w:t>
+      </w:r>
+      <w:proofErr w:type="gramEnd"/>
+      <w:r>
+        <w:t xml:space="preserve">)   </w:t>
       </w:r>
       <w:r>
         <w:tab/>
@@ -417,14 +471,27 @@
       <w:r>
         <w:t>/test-route</w:t>
       </w:r>
+      <w:proofErr w:type="gramStart"/>
       <w:r>
         <w:t>”)</w:t>
       </w:r>
       <w:r>
-        <w:t xml:space="preserve">         #this </w:t>
-      </w:r>
-      <w:r>
-        <w:t xml:space="preserve">is get method fetch only data </w:t>
+        <w:t xml:space="preserve">   </w:t>
+      </w:r>
+      <w:proofErr w:type="gramEnd"/>
+      <w:r>
+        <w:t xml:space="preserve">      #this </w:t>
+      </w:r>
+      <w:r>
+        <w:t xml:space="preserve">is </w:t>
+      </w:r>
+      <w:proofErr w:type="gramStart"/>
+      <w:r>
+        <w:t>get</w:t>
+      </w:r>
+      <w:proofErr w:type="gramEnd"/>
+      <w:r>
+        <w:t xml:space="preserve"> method fetch only data </w:t>
       </w:r>
     </w:p>
     <w:p>
@@ -435,12 +502,17 @@
         <w:t xml:space="preserve">Def </w:t>
       </w:r>
       <w:proofErr w:type="spellStart"/>
+      <w:proofErr w:type="gramStart"/>
       <w:r>
         <w:t>testFuncation</w:t>
       </w:r>
       <w:proofErr w:type="spellEnd"/>
       <w:r>
-        <w:t>():</w:t>
+        <w:t>(</w:t>
+      </w:r>
+      <w:proofErr w:type="gramEnd"/>
+      <w:r>
+        <w:t>):</w:t>
       </w:r>
     </w:p>
     <w:p>
@@ -453,12 +525,17 @@
       </w:r>
       <w:proofErr w:type="spellStart"/>
       <w:r>
-        <w:t>message”:”</w:t>
+        <w:t>message”</w:t>
+      </w:r>
+      <w:proofErr w:type="gramStart"/>
+      <w:r>
+        <w:t>:”</w:t>
       </w:r>
       <w:r>
         <w:t>Your</w:t>
       </w:r>
       <w:proofErr w:type="spellEnd"/>
+      <w:proofErr w:type="gramEnd"/>
       <w:r>
         <w:t xml:space="preserve"> backend server is up fast </w:t>
       </w:r>
@@ -468,10 +545,18 @@
       </w:r>
       <w:proofErr w:type="spellEnd"/>
       <w:r>
-        <w:t xml:space="preserve"> is runed </w:t>
-      </w:r>
-      <w:r>
-        <w:t>”}</w:t>
+        <w:t xml:space="preserve"> is </w:t>
+      </w:r>
+      <w:proofErr w:type="gramStart"/>
+      <w:r>
+        <w:t xml:space="preserve">runed </w:t>
+      </w:r>
+      <w:r>
+        <w:t>”</w:t>
+      </w:r>
+      <w:proofErr w:type="gramEnd"/>
+      <w:r>
+        <w:t>}</w:t>
       </w:r>
     </w:p>
     <w:p>
@@ -585,10 +670,18 @@
         </w:numPr>
       </w:pPr>
       <w:r>
-        <w:t xml:space="preserve">What is path parameter </w:t>
-      </w:r>
-      <w:r>
-        <w:t xml:space="preserve">:- </w:t>
+        <w:t xml:space="preserve">What is path </w:t>
+      </w:r>
+      <w:proofErr w:type="gramStart"/>
+      <w:r>
+        <w:t xml:space="preserve">parameter </w:t>
+      </w:r>
+      <w:r>
+        <w:t>:</w:t>
+      </w:r>
+      <w:proofErr w:type="gramEnd"/>
+      <w:r>
+        <w:t xml:space="preserve">- </w:t>
       </w:r>
       <w:r>
         <w:t xml:space="preserve">In Python, a </w:t>
@@ -640,7 +733,15 @@
           <w:b/>
           <w:bCs/>
         </w:rPr>
-        <w:t xml:space="preserve">How use our program </w:t>
+        <w:t xml:space="preserve">How use our </w:t>
+      </w:r>
+      <w:proofErr w:type="gramStart"/>
+      <w:r>
+        <w:rPr>
+          <w:b/>
+          <w:bCs/>
+        </w:rPr>
+        <w:t xml:space="preserve">program </w:t>
       </w:r>
       <w:r>
         <w:rPr>
@@ -649,6 +750,7 @@
         </w:rPr>
         <w:t xml:space="preserve"> *</w:t>
       </w:r>
+      <w:proofErr w:type="gramEnd"/>
     </w:p>
     <w:p>
       <w:pPr>
@@ -716,12 +818,17 @@
         <w:t xml:space="preserve">App = </w:t>
       </w:r>
       <w:proofErr w:type="spellStart"/>
+      <w:proofErr w:type="gramStart"/>
       <w:r>
         <w:t>FastAPI</w:t>
       </w:r>
       <w:proofErr w:type="spellEnd"/>
       <w:r>
-        <w:t>()</w:t>
+        <w:t>(</w:t>
+      </w:r>
+      <w:proofErr w:type="gramEnd"/>
+      <w:r>
+        <w:t>)</w:t>
       </w:r>
     </w:p>
     <w:p>
@@ -735,11 +842,16 @@
       <w:r>
         <w:t>{pathParameter}</w:t>
       </w:r>
+      <w:proofErr w:type="gramStart"/>
       <w:r>
         <w:t xml:space="preserve">”) </w:t>
       </w:r>
       <w:r>
-        <w:t xml:space="preserve">      # we need to send with route and </w:t>
+        <w:t xml:space="preserve">  </w:t>
+      </w:r>
+      <w:proofErr w:type="gramEnd"/>
+      <w:r>
+        <w:t xml:space="preserve">    # we need to send with route and </w:t>
       </w:r>
       <w:r>
         <w:t xml:space="preserve">function parameter </w:t>
@@ -792,6 +904,7 @@
         <w:t xml:space="preserve"> </w:t>
       </w:r>
       <w:proofErr w:type="spellStart"/>
+      <w:proofErr w:type="gramStart"/>
       <w:r>
         <w:t>pathparameter</w:t>
       </w:r>
@@ -799,6 +912,7 @@
       <w:r>
         <w:t xml:space="preserve"> }</w:t>
       </w:r>
+      <w:proofErr w:type="gramEnd"/>
       <w:r>
         <w:t xml:space="preserve">        </w:t>
       </w:r>
@@ -828,7 +942,15 @@
     </w:p>
     <w:p>
       <w:r>
-        <w:t xml:space="preserve"> This requirement txt file your main file for example you clone your repo that not available </w:t>
+        <w:t xml:space="preserve"> This requirement txt </w:t>
+      </w:r>
+      <w:proofErr w:type="gramStart"/>
+      <w:r>
+        <w:t>file</w:t>
+      </w:r>
+      <w:proofErr w:type="gramEnd"/>
+      <w:r>
+        <w:t xml:space="preserve"> your main file for example you clone your repo that not available </w:t>
       </w:r>
       <w:r>
         <w:t xml:space="preserve">those we need to install this simple create this command throw </w:t>
@@ -1194,12 +1316,17 @@
         <w:t xml:space="preserve">App = </w:t>
       </w:r>
       <w:proofErr w:type="spellStart"/>
+      <w:proofErr w:type="gramStart"/>
       <w:r>
         <w:t>FastAPI</w:t>
       </w:r>
       <w:proofErr w:type="spellEnd"/>
       <w:r>
-        <w:t>()</w:t>
+        <w:t>(</w:t>
+      </w:r>
+      <w:proofErr w:type="gramEnd"/>
+      <w:r>
+        <w:t>)</w:t>
       </w:r>
     </w:p>
     <w:p>
@@ -1271,7 +1398,15 @@
         <w:ind w:left="1080"/>
       </w:pPr>
       <w:r>
-        <w:t xml:space="preserve">#  find logic use for loop in loop find to this id </w:t>
+        <w:t xml:space="preserve">#  </w:t>
+      </w:r>
+      <w:proofErr w:type="gramStart"/>
+      <w:r>
+        <w:t>find</w:t>
+      </w:r>
+      <w:proofErr w:type="gramEnd"/>
+      <w:r>
+        <w:t xml:space="preserve"> logic use for loop in loop find to this id </w:t>
       </w:r>
     </w:p>
     <w:p>
@@ -1349,7 +1484,11 @@
       </w:r>
       <w:r>
         <w:tab/>
-        <w:t>Return {</w:t>
+        <w:t xml:space="preserve">Return </w:t>
+      </w:r>
+      <w:proofErr w:type="gramStart"/>
+      <w:r>
+        <w:t>{</w:t>
       </w:r>
       <w:r>
         <w:t xml:space="preserve"> </w:t>
@@ -1359,6 +1498,7 @@
         <w:t>searchId</w:t>
       </w:r>
       <w:proofErr w:type="spellEnd"/>
+      <w:proofErr w:type="gramEnd"/>
       <w:r>
         <w:t xml:space="preserve"> }</w:t>
       </w:r>
@@ -1393,14 +1533,46 @@
           <w:b/>
           <w:bCs/>
         </w:rPr>
-        <w:t xml:space="preserve">** Request parameter use default python </w:t>
-      </w:r>
-      <w:r>
-        <w:rPr>
-          <w:b/>
-          <w:bCs/>
-        </w:rPr>
-        <w:t xml:space="preserve"> fast </w:t>
+        <w:t xml:space="preserve">** Request </w:t>
+      </w:r>
+      <w:proofErr w:type="gramStart"/>
+      <w:r>
+        <w:rPr>
+          <w:b/>
+          <w:bCs/>
+        </w:rPr>
+        <w:t>parameter</w:t>
+      </w:r>
+      <w:proofErr w:type="gramEnd"/>
+      <w:r>
+        <w:rPr>
+          <w:b/>
+          <w:bCs/>
+        </w:rPr>
+        <w:t xml:space="preserve"> use default </w:t>
+      </w:r>
+      <w:proofErr w:type="gramStart"/>
+      <w:r>
+        <w:rPr>
+          <w:b/>
+          <w:bCs/>
+        </w:rPr>
+        <w:t xml:space="preserve">python </w:t>
+      </w:r>
+      <w:r>
+        <w:rPr>
+          <w:b/>
+          <w:bCs/>
+        </w:rPr>
+        <w:t xml:space="preserve"> fast</w:t>
+      </w:r>
+      <w:proofErr w:type="gramEnd"/>
+      <w:r>
+        <w:rPr>
+          <w:b/>
+          <w:bCs/>
+        </w:rPr>
+        <w:t xml:space="preserve"> </w:t>
       </w:r>
       <w:proofErr w:type="spellStart"/>
       <w:r>
@@ -1441,8 +1613,13 @@
       <w:r>
         <w:t xml:space="preserve">This python free build </w:t>
       </w:r>
-      <w:r>
-        <w:t xml:space="preserve">library  - we can import and used </w:t>
+      <w:proofErr w:type="gramStart"/>
+      <w:r>
+        <w:t>library  -</w:t>
+      </w:r>
+      <w:proofErr w:type="gramEnd"/>
+      <w:r>
+        <w:t xml:space="preserve"> we can import and used </w:t>
       </w:r>
     </w:p>
     <w:p>
@@ -1475,12 +1652,17 @@
         <w:t xml:space="preserve"> import </w:t>
       </w:r>
       <w:proofErr w:type="spellStart"/>
+      <w:proofErr w:type="gramStart"/>
       <w:r>
         <w:t>fastapi</w:t>
       </w:r>
       <w:proofErr w:type="spellEnd"/>
       <w:r>
-        <w:t xml:space="preserve"> ,Request </w:t>
+        <w:t xml:space="preserve"> ,Request</w:t>
+      </w:r>
+      <w:proofErr w:type="gramEnd"/>
+      <w:r>
+        <w:t xml:space="preserve"> </w:t>
       </w:r>
     </w:p>
     <w:p>
@@ -1492,21 +1674,34 @@
         <w:t xml:space="preserve">App = </w:t>
       </w:r>
       <w:proofErr w:type="spellStart"/>
+      <w:proofErr w:type="gramStart"/>
       <w:r>
         <w:t>FastAPI</w:t>
       </w:r>
       <w:proofErr w:type="spellEnd"/>
       <w:r>
-        <w:t>()</w:t>
-      </w:r>
-    </w:p>
-    <w:p>
-      <w:pPr>
-        <w:pStyle w:val="ListParagraph"/>
-        <w:ind w:left="1080"/>
-      </w:pPr>
-      <w:r>
-        <w:t xml:space="preserve"># this object fast </w:t>
+        <w:t>(</w:t>
+      </w:r>
+      <w:proofErr w:type="gramEnd"/>
+      <w:r>
+        <w:t>)</w:t>
+      </w:r>
+    </w:p>
+    <w:p>
+      <w:pPr>
+        <w:pStyle w:val="ListParagraph"/>
+        <w:ind w:left="1080"/>
+      </w:pPr>
+      <w:r>
+        <w:t xml:space="preserve"># </w:t>
+      </w:r>
+      <w:proofErr w:type="gramStart"/>
+      <w:r>
+        <w:t>this</w:t>
+      </w:r>
+      <w:proofErr w:type="gramEnd"/>
+      <w:r>
+        <w:t xml:space="preserve"> object fast </w:t>
       </w:r>
       <w:proofErr w:type="spellStart"/>
       <w:r>
@@ -1570,10 +1765,12 @@
         <w:t>(</w:t>
       </w:r>
       <w:proofErr w:type="spellStart"/>
+      <w:proofErr w:type="gramStart"/>
       <w:r>
         <w:t>request:Request</w:t>
       </w:r>
       <w:proofErr w:type="spellEnd"/>
+      <w:proofErr w:type="gramEnd"/>
       <w:r>
         <w:t>):</w:t>
       </w:r>
@@ -1595,8 +1792,13 @@
         <w:t>(</w:t>
       </w:r>
       <w:proofErr w:type="spellStart"/>
-      <w:r>
-        <w:t>request.path_params</w:t>
+      <w:proofErr w:type="gramStart"/>
+      <w:r>
+        <w:t>request.path</w:t>
+      </w:r>
+      <w:proofErr w:type="gramEnd"/>
+      <w:r>
+        <w:t>_params</w:t>
       </w:r>
       <w:proofErr w:type="spellEnd"/>
       <w:r>
@@ -1702,7 +1904,15 @@
           <w:b/>
           <w:bCs/>
         </w:rPr>
-        <w:t xml:space="preserve">Use following method this type </w:t>
+        <w:t xml:space="preserve">Use following method this </w:t>
+      </w:r>
+      <w:proofErr w:type="gramStart"/>
+      <w:r>
+        <w:rPr>
+          <w:b/>
+          <w:bCs/>
+        </w:rPr>
+        <w:t xml:space="preserve">type </w:t>
       </w:r>
       <w:r>
         <w:rPr>
@@ -1718,6 +1928,7 @@
         </w:rPr>
         <w:t>*</w:t>
       </w:r>
+      <w:proofErr w:type="gramEnd"/>
     </w:p>
     <w:p>
       <w:pPr>
@@ -1836,6 +2047,7 @@
           <w:numId w:val="10"/>
         </w:numPr>
       </w:pPr>
+      <w:proofErr w:type="gramStart"/>
       <w:r>
         <w:rPr>
           <w:b/>
@@ -1848,7 +2060,15 @@
           <w:b/>
           <w:bCs/>
         </w:rPr>
-        <w:t xml:space="preserve">:- </w:t>
+        <w:t>:-</w:t>
+      </w:r>
+      <w:proofErr w:type="gramEnd"/>
+      <w:r>
+        <w:rPr>
+          <w:b/>
+          <w:bCs/>
+        </w:rPr>
+        <w:t xml:space="preserve"> </w:t>
       </w:r>
       <w:r>
         <w:t>Sends a request from the client to the server to delete an existing resource.</w:t>
@@ -1900,14 +2120,30 @@
           <w:b/>
           <w:bCs/>
         </w:rPr>
-        <w:t xml:space="preserve"> throw </w:t>
-      </w:r>
-      <w:r>
-        <w:rPr>
-          <w:b/>
-          <w:bCs/>
-        </w:rPr>
-        <w:t xml:space="preserve"> * </w:t>
+        <w:t xml:space="preserve"> </w:t>
+      </w:r>
+      <w:proofErr w:type="gramStart"/>
+      <w:r>
+        <w:rPr>
+          <w:b/>
+          <w:bCs/>
+        </w:rPr>
+        <w:t xml:space="preserve">throw </w:t>
+      </w:r>
+      <w:r>
+        <w:rPr>
+          <w:b/>
+          <w:bCs/>
+        </w:rPr>
+        <w:t xml:space="preserve"> *</w:t>
+      </w:r>
+      <w:proofErr w:type="gramEnd"/>
+      <w:r>
+        <w:rPr>
+          <w:b/>
+          <w:bCs/>
+        </w:rPr>
+        <w:t xml:space="preserve"> </w:t>
       </w:r>
     </w:p>
     <w:p>
@@ -2075,7 +2311,15 @@
           <w:b/>
           <w:bCs/>
         </w:rPr>
-        <w:t xml:space="preserve">Example of get method </w:t>
+        <w:t xml:space="preserve">Example of get </w:t>
+      </w:r>
+      <w:proofErr w:type="gramStart"/>
+      <w:r>
+        <w:rPr>
+          <w:b/>
+          <w:bCs/>
+        </w:rPr>
+        <w:t xml:space="preserve">method </w:t>
       </w:r>
       <w:r>
         <w:rPr>
@@ -2084,6 +2328,7 @@
         </w:rPr>
         <w:t>:</w:t>
       </w:r>
+      <w:proofErr w:type="gramEnd"/>
     </w:p>
     <w:p>
       <w:r>
@@ -2098,6 +2343,7 @@
         <w:t xml:space="preserve"> import </w:t>
       </w:r>
       <w:proofErr w:type="spellStart"/>
+      <w:proofErr w:type="gramStart"/>
       <w:r>
         <w:t>FastAPI</w:t>
       </w:r>
@@ -2105,6 +2351,7 @@
         <w:t>,Request</w:t>
       </w:r>
       <w:proofErr w:type="spellEnd"/>
+      <w:proofErr w:type="gramEnd"/>
       <w:r>
         <w:t xml:space="preserve"> </w:t>
       </w:r>
@@ -2114,12 +2361,17 @@
         <w:t xml:space="preserve">App = </w:t>
       </w:r>
       <w:proofErr w:type="spellStart"/>
+      <w:proofErr w:type="gramStart"/>
       <w:r>
         <w:t>FastAPI</w:t>
       </w:r>
       <w:proofErr w:type="spellEnd"/>
       <w:r>
-        <w:t xml:space="preserve">()    </w:t>
+        <w:t>(</w:t>
+      </w:r>
+      <w:proofErr w:type="gramEnd"/>
+      <w:r>
+        <w:t xml:space="preserve">)    </w:t>
       </w:r>
       <w:r>
         <w:tab/>
@@ -2140,6 +2392,65 @@
         <w:t xml:space="preserve"> </w:t>
       </w:r>
     </w:p>
+    <w:p/>
+    <w:p>
+      <w:r>
+        <w:t xml:space="preserve"># </w:t>
+      </w:r>
+      <w:proofErr w:type="gramStart"/>
+      <w:r>
+        <w:t>get</w:t>
+      </w:r>
+      <w:proofErr w:type="gramEnd"/>
+      <w:r>
+        <w:t xml:space="preserve"> all data </w:t>
+      </w:r>
+    </w:p>
+    <w:p>
+      <w:r>
+        <w:t>@app.get(“/fetch-all-data”)</w:t>
+      </w:r>
+    </w:p>
+    <w:p>
+      <w:r>
+        <w:t xml:space="preserve">Def </w:t>
+      </w:r>
+      <w:proofErr w:type="spellStart"/>
+      <w:proofErr w:type="gramStart"/>
+      <w:r>
+        <w:t>fetchAllData</w:t>
+      </w:r>
+      <w:proofErr w:type="spellEnd"/>
+      <w:r>
+        <w:t>(</w:t>
+      </w:r>
+      <w:proofErr w:type="gramEnd"/>
+      <w:r>
+        <w:t>):</w:t>
+      </w:r>
+    </w:p>
+    <w:p>
+      <w:r>
+        <w:t>Return {“Message”:</w:t>
+      </w:r>
+      <w:r>
+        <w:t xml:space="preserve"> </w:t>
+      </w:r>
+      <w:proofErr w:type="gramStart"/>
+      <w:r>
+        <w:t xml:space="preserve">product </w:t>
+      </w:r>
+      <w:r>
+        <w:t>}</w:t>
+      </w:r>
+      <w:proofErr w:type="gramEnd"/>
+    </w:p>
+    <w:p/>
+    <w:p/>
+    <w:p/>
+    <w:p/>
+    <w:p/>
+    <w:p/>
     <w:p>
       <w:pPr>
         <w:ind w:left="360"/>
@@ -3867,6 +4178,7 @@
   <w:style w:type="character" w:default="1" w:styleId="DefaultParagraphFont">
     <w:name w:val="Default Paragraph Font"/>
     <w:uiPriority w:val="1"/>
+    <w:semiHidden/>
     <w:unhideWhenUsed/>
   </w:style>
   <w:style w:type="table" w:default="1" w:styleId="TableNormal">

</xml_diff>